<commit_message>
docs: regenera Relatorio de EDA (md+docx) e corrige Relatorio de Integridade
Recalcula os numeros do Relatorio de EDA a partir dos CSVs atuais (razao min 1,00; analfab max 0,84; extremos por municipio). Corrige erros internos do Relatorio de Integridade (C3 invertido, R4 obsoleto, R5/3.1 com V01042).

Co-Authored-By: Claude Opus 4.8 <noreply@anthropic.com>
</commit_message>
<xml_diff>
--- a/docs/Relatorio_EDA_Fase3_IVS_ELSI.docx
+++ b/docs/Relatorio_EDA_Fase3_IVS_ELSI.docx
@@ -97,7 +97,7 @@
           <w:sz w:val="22"/>
           <w:szCs w:val="22"/>
         </w:rPr>
-        <w:t xml:space="preserve">15 de maio de 2026</w:t>
+        <w:t xml:space="preserve">12 de junho de 2026 (regerado sobre a metodologia V00001 consolidada em 22/05/2026)</w:t>
       </w:r>
     </w:p>
     <w:p>
@@ -127,7 +127,7 @@
         <w:jc w:val="both"/>
       </w:pPr>
       <w:r>
-        <w:t xml:space="preserve">A análise exploratória foi conduzida sobre uma base de 109.032 setores censitários dos 70 municípios da amostra do ELSI-Brasil, extraídos do Censo Demográfico 2022. Após aplicar as regras de elegibilidade definidas pelo IVS-BH 2012 (Secretaria Municipal de Saúde de Belo Horizonte), 106.281 setores (97,5%) foram considerados aptos para a análise. As sete variáveis-componente do IVS foram calculadas em proporções brutas, com denominador V01042 (Total de Responsáveis), conforme a metodologia operacional do IVS-BH.</w:t>
+        <w:t xml:space="preserve">A análise exploratória foi conduzida sobre uma base de 109.032 setores censitários dos 70 municípios da amostra do ELSI-Brasil, extraídos do Censo Demográfico 2022. Após aplicar as regras de elegibilidade definidas pelo IVS-BH 2012 (Secretaria Municipal de Saúde de Belo Horizonte), 106.281 setores (97,5%) foram considerados aptos para a análise. As sete variáveis-componente do IVS foram calculadas em proporções brutas, com denominador domiciliar V00001 (Domicílios Particulares Permanentes Ocupados) — o equivalente no Censo 2022 do denominador padrão do IVS-BH 2012.</w:t>
       </w:r>
     </w:p>
     <w:p>
@@ -162,7 +162,7 @@
         <w:spacing w:after="80"/>
       </w:pPr>
       <w:r>
-        <w:t xml:space="preserve">Gradiente Norte→Sul replica o padrão histórico de desigualdade. A região Norte apresenta as piores condições em água (35,6% setores inadequados em média), esgoto (27,1%) e densidade habitacional (mediana de 3,20 pessoas por domicílio). Em contraste, Sul e Sudeste exibem proporções de inadequação abaixo de 5% para água e esgoto. A renda média segue o mesmo eixo, com municípios do Nordeste e Norte abaixo de R$ 1.800 (mediana) versus São Caetano do Sul/SP em R$ 5.292.</w:t>
+        <w:t xml:space="preserve">Gradiente Norte→Sul replica o padrão histórico de desigualdade. A região Norte apresenta as piores condições em água (35,6% setores inadequados em média), esgoto (27,1%) e densidade habitacional (mediana de 3,20 pessoas por domicílio). Em contraste, Sul e Sudeste exibem proporções médias de inadequação em torno de 5% ou menos para água e esgoto (medianas iguais a zero). A renda média segue o mesmo eixo, com municípios do Nordeste e Norte abaixo de R$ 1.800 (mediana) versus São Caetano do Sul/SP em R$ 5.292.</w:t>
       </w:r>
     </w:p>
     <w:p>
@@ -520,7 +520,7 @@
                 <w:sz w:val="20"/>
                 <w:szCs w:val="20"/>
               </w:rPr>
-              <w:t xml:space="preserve">V01042</w:t>
+              <w:t xml:space="preserve">V00001</w:t>
             </w:r>
           </w:p>
         </w:tc>
@@ -646,7 +646,7 @@
                 <w:sz w:val="20"/>
                 <w:szCs w:val="20"/>
               </w:rPr>
-              <w:t xml:space="preserve">V01042</w:t>
+              <w:t xml:space="preserve">V00001</w:t>
             </w:r>
           </w:p>
         </w:tc>
@@ -768,7 +768,7 @@
                 <w:sz w:val="20"/>
                 <w:szCs w:val="20"/>
               </w:rPr>
-              <w:t xml:space="preserve">V01042</w:t>
+              <w:t xml:space="preserve">V00001</w:t>
             </w:r>
           </w:p>
         </w:tc>
@@ -894,7 +894,7 @@
                 <w:sz w:val="20"/>
                 <w:szCs w:val="20"/>
               </w:rPr>
-              <w:t xml:space="preserve">V01042</w:t>
+              <w:t xml:space="preserve">V00001 + V00002</w:t>
             </w:r>
           </w:p>
         </w:tc>
@@ -1016,7 +1016,7 @@
                 <w:sz w:val="20"/>
                 <w:szCs w:val="20"/>
               </w:rPr>
-              <w:t xml:space="preserve">V00900</w:t>
+              <w:t xml:space="preserve">V00900 + V00901</w:t>
             </w:r>
           </w:p>
         </w:tc>
@@ -1284,7 +1284,7 @@
           <w:i/>
           <w:iCs/>
         </w:rPr>
-        <w:t xml:space="preserve">O denominador V01042 (Total de Responsáveis) foi adotado para os indicadores de saneamento conforme a recomendação explícita do documento oficial "Cálculo IVS2012.docx": "achamos melhor considerar o número de responsáveis como número total de domicílios do setor".</w:t>
+        <w:t xml:space="preserve">O denominador domiciliar V00001 (Domicílios Particulares Permanentes Ocupados) foi adotado por ser o equivalente no Censo 2022 do V002 (Dom_part_p) do Censo 2010, denominador padrão do IVS-BH 2012. Decisão consolidada na revisão metodológica de 22/05/2026: o V01042 do arquivo de parentesco é uma contagem de pessoas responsáveis, não de domicílios, e foi descartado como denominador. Validação empírica: com V00001 nenhuma proporção de saneamento ultrapassa 1,0.</w:t>
       </w:r>
     </w:p>
     <w:p>
@@ -2648,7 +2648,7 @@
                 <w:sz w:val="20"/>
                 <w:szCs w:val="20"/>
               </w:rPr>
-              <w:t xml:space="preserve">Alguma variável-base (v0001, V00001, V01042) sigilosa</w:t>
+              <w:t xml:space="preserve">Variável-base (v0001 ou V00001) sigilosa</w:t>
             </w:r>
           </w:p>
         </w:tc>
@@ -4662,7 +4662,7 @@
                 <w:sz w:val="20"/>
                 <w:szCs w:val="20"/>
               </w:rPr>
-              <w:t xml:space="preserve">0,042</w:t>
+              <w:t xml:space="preserve">0,039</w:t>
             </w:r>
           </w:p>
         </w:tc>
@@ -4692,7 +4692,7 @@
                 <w:sz w:val="20"/>
                 <w:szCs w:val="20"/>
               </w:rPr>
-              <w:t xml:space="preserve">0,029</w:t>
+              <w:t xml:space="preserve">0,028</w:t>
             </w:r>
           </w:p>
         </w:tc>
@@ -4722,7 +4722,7 @@
                 <w:sz w:val="20"/>
                 <w:szCs w:val="20"/>
               </w:rPr>
-              <w:t xml:space="preserve">0,051</w:t>
+              <w:t xml:space="preserve">0,041</w:t>
             </w:r>
           </w:p>
         </w:tc>
@@ -4782,7 +4782,7 @@
                 <w:sz w:val="20"/>
                 <w:szCs w:val="20"/>
               </w:rPr>
-              <w:t xml:space="preserve">0,055</w:t>
+              <w:t xml:space="preserve">0,052</w:t>
             </w:r>
           </w:p>
         </w:tc>
@@ -4812,7 +4812,7 @@
                 <w:sz w:val="20"/>
                 <w:szCs w:val="20"/>
               </w:rPr>
-              <w:t xml:space="preserve">+4,69</w:t>
+              <w:t xml:space="preserve">+2,98</w:t>
             </w:r>
           </w:p>
         </w:tc>
@@ -4842,7 +4842,7 @@
                 <w:sz w:val="20"/>
                 <w:szCs w:val="20"/>
               </w:rPr>
-              <w:t xml:space="preserve">+44,1</w:t>
+              <w:t xml:space="preserve">+17,7</w:t>
             </w:r>
           </w:p>
         </w:tc>
@@ -5499,7 +5499,7 @@
         <w:jc w:val="both"/>
       </w:pPr>
       <w:r>
-        <w:t xml:space="preserve">A cobertura efetiva de 84% (16% sigilo) reflete a supressão do IBGE em setores com poucos indivíduos de 15 anos ou mais (denominador V00900). A mediana de 2,9% é compatível com a taxa nacional de analfabetismo de ~7% — esperada inferior em territórios urbanos. A altíssima curtose (+44) indica a existência de setores com taxa de analfabetismo extremamente elevada, concentrados em pequenos municípios do Nordeste rural (Arara/PB mediana de 45%, Jaqueira/PE 33%, Água Preta/PE 32%).</w:t>
+        <w:t xml:space="preserve">A cobertura efetiva de 84% (15,8% sigilo) reflete a supressão do IBGE em setores com poucos indivíduos de 15 anos ou mais. Com o denominador correto V00901 / (V00900 + V00901), a taxa fica naturalmente limitada a [0, 1] (máximo observado 84,2%, contra os valores espúrios maiores que 1 que a fórmula anterior V00901 / V00900 produzia). A mediana de 2,8% é compatível com a taxa nacional de analfabetismo — esperada inferior em territórios urbanos. A alta curtose (+17,7) indica a existência de setores com taxa de analfabetismo extremamente elevada, concentrados em pequenos municípios do Nordeste rural (Arara/PB mediana de 31,1%, Jaqueira/PE 24,9%, Água Preta/PE 24,2%).</w:t>
       </w:r>
     </w:p>
     <w:p>
@@ -6124,7 +6124,7 @@
                 <w:sz w:val="20"/>
                 <w:szCs w:val="20"/>
               </w:rPr>
-              <w:t xml:space="preserve">0,031</w:t>
+              <w:t xml:space="preserve">0,030</w:t>
             </w:r>
           </w:p>
         </w:tc>
@@ -6372,7 +6372,7 @@
                 <w:sz w:val="20"/>
                 <w:szCs w:val="20"/>
               </w:rPr>
-              <w:t xml:space="preserve">0,056</w:t>
+              <w:t xml:space="preserve">0,053</w:t>
             </w:r>
           </w:p>
         </w:tc>
@@ -7216,7 +7216,7 @@
         <w:spacing w:after="80"/>
       </w:pPr>
       <w:r>
-        <w:t xml:space="preserve">Norte e Nordeste concentram a precariedade. A Região Norte lidera tanto na inadequação de água (mediana de 20% dos setores) quanto na densidade habitacional (3,2 pessoas por domicílio). O Nordeste tem a pior renda (mediana R$ 1.693) e o pior analfabetismo (5,6%).</w:t>
+        <w:t xml:space="preserve">Norte e Nordeste concentram a precariedade. A Região Norte lidera tanto na inadequação de água (mediana de 20% dos setores) quanto na densidade habitacional (3,2 pessoas por domicílio). O Nordeste tem a pior renda (mediana R$ 1.693) e o pior analfabetismo (5,3%).</w:t>
       </w:r>
     </w:p>
     <w:p>
@@ -7564,7 +7564,7 @@
                 <w:sz w:val="20"/>
                 <w:szCs w:val="20"/>
               </w:rPr>
-              <w:t xml:space="preserve">Portel/PA — 98,9%</w:t>
+              <w:t xml:space="preserve">Portel/PA — 99,0%</w:t>
             </w:r>
           </w:p>
         </w:tc>
@@ -7594,7 +7594,7 @@
                 <w:sz w:val="20"/>
                 <w:szCs w:val="20"/>
               </w:rPr>
-              <w:t xml:space="preserve">Placas/PA — 98,5%</w:t>
+              <w:t xml:space="preserve">Placas/PA — 98,7%</w:t>
             </w:r>
           </w:p>
         </w:tc>
@@ -7624,7 +7624,7 @@
                 <w:sz w:val="20"/>
                 <w:szCs w:val="20"/>
               </w:rPr>
-              <w:t xml:space="preserve">Portel/PA — 99,2%</w:t>
+              <w:t xml:space="preserve">Portel/PA — 99,4%</w:t>
             </w:r>
           </w:p>
         </w:tc>
@@ -7688,7 +7688,7 @@
                 <w:sz w:val="20"/>
                 <w:szCs w:val="20"/>
               </w:rPr>
-              <w:t xml:space="preserve">Placas/PA — 96,8%</w:t>
+              <w:t xml:space="preserve">Placas/PA — 97,1%</w:t>
             </w:r>
           </w:p>
         </w:tc>
@@ -7719,7 +7719,7 @@
                 <w:sz w:val="20"/>
                 <w:szCs w:val="20"/>
               </w:rPr>
-              <w:t xml:space="preserve">Santa Maria do Oeste/PR — 98,3%</w:t>
+              <w:t xml:space="preserve">Portel/PA — 98,4%</w:t>
             </w:r>
           </w:p>
         </w:tc>
@@ -7842,7 +7842,7 @@
                 <w:sz w:val="20"/>
                 <w:szCs w:val="20"/>
               </w:rPr>
-              <w:t xml:space="preserve">Urandi/BA — 98,2%</w:t>
+              <w:t xml:space="preserve">Santa Maria do Oeste/PR — 98,3%</w:t>
             </w:r>
           </w:p>
         </w:tc>
@@ -7967,7 +7967,7 @@
                 <w:sz w:val="20"/>
                 <w:szCs w:val="20"/>
               </w:rPr>
-              <w:t xml:space="preserve">Japoatã/SE — 98,2%</w:t>
+              <w:t xml:space="preserve">Urandi/BA — 98,2%</w:t>
             </w:r>
           </w:p>
         </w:tc>
@@ -8090,7 +8090,7 @@
                 <w:sz w:val="20"/>
                 <w:szCs w:val="20"/>
               </w:rPr>
-              <w:t xml:space="preserve">Vicentinópolis/GO — 97,9%</w:t>
+              <w:t xml:space="preserve">Japoatã/SE — 98,2%</w:t>
             </w:r>
           </w:p>
         </w:tc>
@@ -8132,7 +8132,7 @@
         <w:jc w:val="both"/>
       </w:pPr>
       <w:r>
-        <w:t xml:space="preserve">Os municípios do Pará (Portel, Placas) e Amazonas (Autazes) aparecem sistematicamente entre os piores em todos os três quesitos. Coroaci/MG, Santa Maria do Oeste/PR, Urandi/BA e Vicentinópolis/GO são pequenos municípios rurais cuja inadequação tende a ser próxima de 100% em quase todos os setores (atenção para o n pequeno, 29 a 47 setores).</w:t>
+        <w:t xml:space="preserve">Os municípios do Pará (Portel, Placas) e Amazonas (Autazes) aparecem sistematicamente entre os piores em todos os três quesitos. Coroaci/MG, Santa Maria do Oeste/PR, Urandi/BA e Japoatã/SE são pequenos municípios rurais cuja inadequação tende a ser próxima de 100% em quase todos os setores (atenção para o n pequeno, 29 a 47 setores).</w:t>
       </w:r>
     </w:p>
     <w:p>
@@ -8804,7 +8804,7 @@
         <w:spacing w:after="80"/>
       </w:pPr>
       <w:r>
-        <w:t xml:space="preserve">Maior taxa de analfabetismo: Arara/PB (45%), Jaqueira/PE (33%), Água Preta/PE (32%) — municípios pequenos do Nordeste interior.</w:t>
+        <w:t xml:space="preserve">Maior taxa de analfabetismo: Arara/PB (31,1%), Jaqueira/PE (24,9%), Água Preta/PE (24,2%) — municípios pequenos do Nordeste interior.</w:t>
       </w:r>
     </w:p>
     <w:p>
@@ -9057,7 +9057,7 @@
                 <w:sz w:val="20"/>
                 <w:szCs w:val="20"/>
               </w:rPr>
-              <w:t xml:space="preserve">21.502</w:t>
+              <w:t xml:space="preserve">21.476</w:t>
             </w:r>
           </w:p>
         </w:tc>
@@ -9181,7 +9181,7 @@
                 <w:sz w:val="20"/>
                 <w:szCs w:val="20"/>
               </w:rPr>
-              <w:t xml:space="preserve">21.145</w:t>
+              <w:t xml:space="preserve">21.158</w:t>
             </w:r>
           </w:p>
         </w:tc>
@@ -9305,7 +9305,7 @@
                 <w:sz w:val="20"/>
                 <w:szCs w:val="20"/>
               </w:rPr>
-              <w:t xml:space="preserve">19.564</w:t>
+              <w:t xml:space="preserve">19.557</w:t>
             </w:r>
           </w:p>
         </w:tc>
@@ -9553,7 +9553,7 @@
                 <w:sz w:val="20"/>
                 <w:szCs w:val="20"/>
               </w:rPr>
-              <w:t xml:space="preserve">5.344</w:t>
+              <w:t xml:space="preserve">4.696</w:t>
             </w:r>
           </w:p>
         </w:tc>
@@ -9583,7 +9583,7 @@
                 <w:sz w:val="20"/>
                 <w:szCs w:val="20"/>
               </w:rPr>
-              <w:t xml:space="preserve">6,0%</w:t>
+              <w:t xml:space="preserve">5,3%</w:t>
             </w:r>
           </w:p>
         </w:tc>
@@ -9677,7 +9677,7 @@
                 <w:sz w:val="20"/>
                 <w:szCs w:val="20"/>
               </w:rPr>
-              <w:t xml:space="preserve">3.841</w:t>
+              <w:t xml:space="preserve">3.829</w:t>
             </w:r>
           </w:p>
         </w:tc>
@@ -11788,7 +11788,7 @@
         <w:jc w:val="both"/>
       </w:pPr>
       <w:r>
-        <w:t xml:space="preserve">Inversamente, 10 municípios pequenos têm zero missing em todas as variáveis: Arara/PB, Coroaci/MG, Ibatiba/ES, Itajuípe/BA, Jaqueira/PE, Portel/PA, Salinas/MG, Santa Maria do Oeste/PR, São Raimundo do Doca Bezerra/MA, Urandi/BA.</w:t>
+        <w:t xml:space="preserve">Inversamente, 11 municípios pequenos têm zero missing em todas as variáveis: Arara/PB, Coroaci/MG, Ibatiba/ES, Itajuípe/BA, Jaqueira/PE, Portel/PA, Salinas/MG, Santa Maria do Oeste/PR, São Raimundo do Doca Bezerra/MA, Urandi/BA e Água Preta/PE.</w:t>
       </w:r>
     </w:p>
     <w:p>
@@ -15175,7 +15175,7 @@
                 <w:sz w:val="20"/>
                 <w:szCs w:val="20"/>
               </w:rPr>
-              <w:t xml:space="preserve">109k setores × 50 colunas</w:t>
+              <w:t xml:space="preserve">109k setores × 47 colunas</w:t>
             </w:r>
           </w:p>
         </w:tc>

</xml_diff>

<commit_message>
fix(eda): alinha arredondamento de assimetria/curtose e 2 correlacoes ao CSV/figura
Auditoria pos-verificacao: assimetria/curtose de agua/esgoto/lixo/razao na Tabela 1 e mediana da razao (2,72) estavam com valores da versao antiga; correlacoes analfab x raca/cor (0,62) e agua x lixo (0,14) e o outlier de analfabetismo (5,2%) agora seguem exatamente a saida do pipeline. Aplicado na apresentacao, no Relatorio de EDA (md+docx) e no de Integridade. Nenhuma interpretacao muda.

Co-Authored-By: Claude Opus 4.8 <noreply@anthropic.com>
</commit_message>
<xml_diff>
--- a/docs/Relatorio_EDA_Fase3_IVS_ELSI.docx
+++ b/docs/Relatorio_EDA_Fase3_IVS_ELSI.docx
@@ -175,7 +175,7 @@
         <w:spacing w:after="80"/>
       </w:pPr>
       <w:r>
-        <w:t xml:space="preserve">Correlação forte e estruturada entre as variáveis socioeconômicas. A correlação de Spearman entre renda média e proporção de pessoas pretas, pardas e indígenas é de −0,81 — o maior valor absoluto observado entre todos os pares. Renda e analfabetismo têm correlação de −0,75, e raça/cor com analfabetismo de +0,63. As variáveis de saneamento se correlacionam menos entre si (0,15 a 0,45), mas todas se associam ao bloco socioeconômico. Esse padrão sustenta a hipótese de dois fatores latentes — saneamento e socioeconômico — recomendada pelo IVS-BH 2012.</w:t>
+        <w:t xml:space="preserve">Correlação forte e estruturada entre as variáveis socioeconômicas. A correlação de Spearman entre renda média e proporção de pessoas pretas, pardas e indígenas é de −0,81 — o maior valor absoluto observado entre todos os pares. Renda e analfabetismo têm correlação de −0,75, e raça/cor com analfabetismo de +0,62. As variáveis de saneamento se correlacionam menos entre si (0,14 a 0,45), mas todas se associam ao bloco socioeconômico. Esse padrão sustenta a hipótese de dois fatores latentes — saneamento e socioeconômico — recomendada pelo IVS-BH 2012.</w:t>
       </w:r>
     </w:p>
     <w:p>
@@ -3736,7 +3736,7 @@
                 <w:sz w:val="20"/>
                 <w:szCs w:val="20"/>
               </w:rPr>
-              <w:t xml:space="preserve">+8,47</w:t>
+              <w:t xml:space="preserve">+8,46</w:t>
             </w:r>
           </w:p>
         </w:tc>
@@ -3986,7 +3986,7 @@
                 <w:sz w:val="20"/>
                 <w:szCs w:val="20"/>
               </w:rPr>
-              <w:t xml:space="preserve">+2,77</w:t>
+              <w:t xml:space="preserve">+2,76</w:t>
             </w:r>
           </w:p>
         </w:tc>
@@ -4017,7 +4017,7 @@
                 <w:sz w:val="20"/>
                 <w:szCs w:val="20"/>
               </w:rPr>
-              <w:t xml:space="preserve">+6,54</w:t>
+              <w:t xml:space="preserve">+6,52</w:t>
             </w:r>
           </w:p>
         </w:tc>
@@ -4259,7 +4259,7 @@
                 <w:sz w:val="20"/>
                 <w:szCs w:val="20"/>
               </w:rPr>
-              <w:t xml:space="preserve">+2,24</w:t>
+              <w:t xml:space="preserve">+2,23</w:t>
             </w:r>
           </w:p>
         </w:tc>
@@ -4289,7 +4289,7 @@
                 <w:sz w:val="20"/>
                 <w:szCs w:val="20"/>
               </w:rPr>
-              <w:t xml:space="preserve">+3,70</w:t>
+              <w:t xml:space="preserve">+3,68</w:t>
             </w:r>
           </w:p>
         </w:tc>
@@ -4415,7 +4415,7 @@
                 <w:sz w:val="20"/>
                 <w:szCs w:val="20"/>
               </w:rPr>
-              <w:t xml:space="preserve">2,71</w:t>
+              <w:t xml:space="preserve">2,72</w:t>
             </w:r>
           </w:p>
         </w:tc>
@@ -4539,7 +4539,7 @@
                 <w:sz w:val="20"/>
                 <w:szCs w:val="20"/>
               </w:rPr>
-              <w:t xml:space="preserve">+0,08</w:t>
+              <w:t xml:space="preserve">+0,09</w:t>
             </w:r>
           </w:p>
         </w:tc>
@@ -4570,7 +4570,7 @@
                 <w:sz w:val="20"/>
                 <w:szCs w:val="20"/>
               </w:rPr>
-              <w:t xml:space="preserve">+3,91</w:t>
+              <w:t xml:space="preserve">+3,90</w:t>
             </w:r>
           </w:p>
         </w:tc>
@@ -5474,7 +5474,7 @@
         <w:jc w:val="both"/>
       </w:pPr>
       <w:r>
-        <w:t xml:space="preserve">Variável de comportamento mais simétrico (assimetria +0,08) — média (2,70) e mediana (2,71) praticamente coincidem. A densidade média brasileira de moradores por domicílio é historicamente próxima de 3,0; o valor observado está dentro do esperado. A baixa variabilidade (CV = 14,8%) sugere que esta variável contribuirá com menos discriminação ao IVS do que as variáveis de saneamento, mas é homogeneamente informativa.</w:t>
+        <w:t xml:space="preserve">Variável de comportamento mais simétrico (assimetria +0,09) — média (2,70) e mediana (2,72) praticamente coincidem. A densidade média brasileira de moradores por domicílio é historicamente próxima de 3,0; o valor observado está dentro do esperado. A baixa variabilidade (CV = 14,8%) sugere que esta variável contribuirá com menos discriminação ao IVS do que as variáveis de saneamento, mas é homogeneamente informativa.</w:t>
       </w:r>
     </w:p>
     <w:p>
@@ -9583,7 +9583,7 @@
                 <w:sz w:val="20"/>
                 <w:szCs w:val="20"/>
               </w:rPr>
-              <w:t xml:space="preserve">5,3%</w:t>
+              <w:t xml:space="preserve">5,2%</w:t>
             </w:r>
           </w:p>
         </w:tc>
@@ -12319,7 +12319,7 @@
                 <w:sz w:val="20"/>
                 <w:szCs w:val="20"/>
               </w:rPr>
-              <w:t xml:space="preserve">0,15</w:t>
+              <w:t xml:space="preserve">0,14</w:t>
             </w:r>
           </w:p>
         </w:tc>
@@ -12751,7 +12751,7 @@
                 <w:sz w:val="20"/>
                 <w:szCs w:val="20"/>
               </w:rPr>
-              <w:t xml:space="preserve">0,15</w:t>
+              <w:t xml:space="preserve">0,14</w:t>
             </w:r>
           </w:p>
         </w:tc>
@@ -13423,7 +13423,7 @@
                 <w:sz w:val="20"/>
                 <w:szCs w:val="20"/>
               </w:rPr>
-              <w:t xml:space="preserve">0,63</w:t>
+              <w:t xml:space="preserve">0,62</w:t>
             </w:r>
           </w:p>
         </w:tc>
@@ -13855,7 +13855,7 @@
                 <w:sz w:val="20"/>
                 <w:szCs w:val="20"/>
               </w:rPr>
-              <w:t xml:space="preserve">0,63</w:t>
+              <w:t xml:space="preserve">0,62</w:t>
             </w:r>
           </w:p>
         </w:tc>
@@ -13998,7 +13998,7 @@
         <w:spacing w:after="80"/>
       </w:pPr>
       <w:r>
-        <w:t xml:space="preserve">analfabetismo × PPI = +0,63</w:t>
+        <w:t xml:space="preserve">analfabetismo × PPI = +0,62</w:t>
       </w:r>
     </w:p>
     <w:p>
@@ -14025,7 +14025,7 @@
         <w:jc w:val="both"/>
       </w:pPr>
       <w:r>
-        <w:t xml:space="preserve">Eixo saneamento (dimensão secundária). Água, esgoto e lixo formam um bloco coerente, mas com correlações entre si mais modestas (0,15 a 0,45). A correlação esgoto × analfabetismo = +0,45 sugere que esgoto inadequado pode estar relacionado a contextos socioeconômicos vulneráveis — uma correlação cruzada entre dimensões.</w:t>
+        <w:t xml:space="preserve">Eixo saneamento (dimensão secundária). Água, esgoto e lixo formam um bloco coerente, mas com correlações entre si mais modestas (0,14 a 0,45). A correlação esgoto × analfabetismo = +0,45 sugere que esgoto inadequado pode estar relacionado a contextos socioeconômicos vulneráveis — uma correlação cruzada entre dimensões.</w:t>
       </w:r>
     </w:p>
     <w:p>
@@ -14710,7 +14710,7 @@
                 <w:sz w:val="20"/>
                 <w:szCs w:val="20"/>
               </w:rPr>
-              <w:t xml:space="preserve">Correlação 0,15 entre água e lixo</w:t>
+              <w:t xml:space="preserve">Correlação 0,14 entre água e lixo</w:t>
             </w:r>
           </w:p>
         </w:tc>

</xml_diff>